<commit_message>
Add documentation for Agentic Retrieval loop mechanism in video hashing
This commit introduces a comprehensive markdown document detailing the core concepts and implementation mechanisms of the Agentic Retrieval loop in the RF-CLaTH framework. The document outlines the overall closed-loop process, including observation, action, feedback, memory, and adaptation. It also explains the roles of various components, such as planned and actual retrieval, and how feedback influences training through a self-calibrated memory contrastive loss. Additionally, it provides pseudocode for a training iteration and visual aids to enhance understanding.
</commit_message>
<xml_diff>
--- a/doc/agentic_retrieval_group_meeting_talk.docx
+++ b/doc/agentic_retrieval_group_meeting_talk.docx
@@ -7,13 +7,15 @@
         <w:spacing w:before="0" w:after="120" w:line="300" w:lineRule="auto"/>
         <w:rPr>
           <w:rFonts w:hint="default" w:ascii="Times New Roman Regular" w:hAnsi="Times New Roman Regular" w:cs="Times New Roman Regular"/>
+          <w:sz w:val="24"/>
+          <w:szCs w:val="24"/>
         </w:rPr>
       </w:pPr>
       <w:r>
         <w:rPr>
           <w:rFonts w:hint="default" w:ascii="Times New Roman Regular" w:hAnsi="Times New Roman Regular" w:eastAsia="微软雅黑" w:cs="Times New Roman Regular"/>
-          <w:sz w:val="22"/>
-          <w:szCs w:val="22"/>
+          <w:sz w:val="24"/>
+          <w:szCs w:val="24"/>
         </w:rPr>
         <w:t>传统视频哈希最终服务的是检索，但训练时通常只优化固定正负关系，训练目标并不知道当前 hash code 实际检索到了什么。</w:t>
       </w:r>
@@ -23,13 +25,15 @@
         <w:spacing w:before="0" w:after="120" w:line="300" w:lineRule="auto"/>
         <w:rPr>
           <w:rFonts w:hint="default" w:ascii="Times New Roman Regular" w:hAnsi="Times New Roman Regular" w:cs="Times New Roman Regular"/>
+          <w:sz w:val="24"/>
+          <w:szCs w:val="24"/>
         </w:rPr>
       </w:pPr>
       <w:r>
         <w:rPr>
           <w:rFonts w:hint="default" w:ascii="Times New Roman Regular" w:hAnsi="Times New Roman Regular" w:eastAsia="微软雅黑" w:cs="Times New Roman Regular"/>
-          <w:sz w:val="22"/>
-          <w:szCs w:val="22"/>
+          <w:sz w:val="24"/>
+          <w:szCs w:val="24"/>
         </w:rPr>
         <w:t>Agentic Retrieval：模型先产生哈希码并执行一次检索动作，然后用检索反馈修正下一轮训练。Agentic 的含义是</w:t>
       </w:r>
@@ -37,8 +41,8 @@
         <w:rPr>
           <w:rFonts w:hint="default" w:ascii="Times New Roman Regular" w:hAnsi="Times New Roman Regular" w:eastAsia="微软雅黑" w:cs="Times New Roman Regular"/>
           <w:color w:val="0000FF"/>
-          <w:sz w:val="22"/>
-          <w:szCs w:val="22"/>
+          <w:sz w:val="24"/>
+          <w:szCs w:val="24"/>
         </w:rPr>
         <w:t>训练系统具备显式状态、行动、反馈、记忆和自适应更新。</w:t>
       </w:r>
@@ -80,6 +84,8 @@
               <w:spacing w:before="0" w:after="40" w:line="300" w:lineRule="auto"/>
               <w:rPr>
                 <w:rFonts w:hint="default" w:ascii="Times New Roman Regular" w:hAnsi="Times New Roman Regular" w:cs="Times New Roman Regular"/>
+                <w:sz w:val="24"/>
+                <w:szCs w:val="24"/>
               </w:rPr>
             </w:pPr>
             <w:r>
@@ -88,8 +94,8 @@
                 <w:b/>
                 <w:bCs/>
                 <w:color w:val="1F4D78"/>
-                <w:sz w:val="22"/>
-                <w:szCs w:val="22"/>
+                <w:sz w:val="24"/>
+                <w:szCs w:val="24"/>
               </w:rPr>
               <w:t>环节</w:t>
             </w:r>
@@ -106,6 +112,8 @@
               <w:spacing w:before="0" w:after="40" w:line="300" w:lineRule="auto"/>
               <w:rPr>
                 <w:rFonts w:hint="default" w:ascii="Times New Roman Regular" w:hAnsi="Times New Roman Regular" w:cs="Times New Roman Regular"/>
+                <w:sz w:val="24"/>
+                <w:szCs w:val="24"/>
               </w:rPr>
             </w:pPr>
           </w:p>
@@ -122,13 +130,15 @@
               <w:spacing w:before="0" w:after="80" w:line="300" w:lineRule="auto"/>
               <w:rPr>
                 <w:rFonts w:hint="default" w:ascii="Times New Roman Regular" w:hAnsi="Times New Roman Regular" w:cs="Times New Roman Regular"/>
-              </w:rPr>
-            </w:pPr>
-            <w:r>
-              <w:rPr>
-                <w:rFonts w:hint="default" w:ascii="Times New Roman Regular" w:hAnsi="Times New Roman Regular" w:eastAsia="微软雅黑" w:cs="Times New Roman Regular"/>
-                <w:sz w:val="22"/>
-                <w:szCs w:val="22"/>
+                <w:sz w:val="24"/>
+                <w:szCs w:val="24"/>
+              </w:rPr>
+            </w:pPr>
+            <w:r>
+              <w:rPr>
+                <w:rFonts w:hint="default" w:ascii="Times New Roman Regular" w:hAnsi="Times New Roman Regular" w:eastAsia="微软雅黑" w:cs="Times New Roman Regular"/>
+                <w:sz w:val="24"/>
+                <w:szCs w:val="24"/>
               </w:rPr>
               <w:t>Observation</w:t>
             </w:r>
@@ -144,13 +154,15 @@
               <w:spacing w:before="0" w:after="80" w:line="300" w:lineRule="auto"/>
               <w:rPr>
                 <w:rFonts w:hint="default" w:ascii="Times New Roman Regular" w:hAnsi="Times New Roman Regular" w:cs="Times New Roman Regular"/>
-              </w:rPr>
-            </w:pPr>
-            <w:r>
-              <w:rPr>
-                <w:rFonts w:hint="default" w:ascii="Times New Roman Regular" w:hAnsi="Times New Roman Regular" w:eastAsia="微软雅黑" w:cs="Times New Roman Regular"/>
-                <w:sz w:val="22"/>
-                <w:szCs w:val="22"/>
+                <w:sz w:val="24"/>
+                <w:szCs w:val="24"/>
+              </w:rPr>
+            </w:pPr>
+            <w:r>
+              <w:rPr>
+                <w:rFonts w:hint="default" w:ascii="Times New Roman Regular" w:hAnsi="Times New Roman Regular" w:eastAsia="微软雅黑" w:cs="Times New Roman Regular"/>
+                <w:sz w:val="24"/>
+                <w:szCs w:val="24"/>
               </w:rPr>
               <w:t>模型看到当前样本表示、邻居统计、memory 状态和训练预算。</w:t>
             </w:r>
@@ -168,13 +180,15 @@
               <w:spacing w:before="0" w:after="80" w:line="300" w:lineRule="auto"/>
               <w:rPr>
                 <w:rFonts w:hint="default" w:ascii="Times New Roman Regular" w:hAnsi="Times New Roman Regular" w:cs="Times New Roman Regular"/>
-              </w:rPr>
-            </w:pPr>
-            <w:r>
-              <w:rPr>
-                <w:rFonts w:hint="default" w:ascii="Times New Roman Regular" w:hAnsi="Times New Roman Regular" w:eastAsia="微软雅黑" w:cs="Times New Roman Regular"/>
-                <w:sz w:val="22"/>
-                <w:szCs w:val="22"/>
+                <w:sz w:val="24"/>
+                <w:szCs w:val="24"/>
+              </w:rPr>
+            </w:pPr>
+            <w:r>
+              <w:rPr>
+                <w:rFonts w:hint="default" w:ascii="Times New Roman Regular" w:hAnsi="Times New Roman Regular" w:eastAsia="微软雅黑" w:cs="Times New Roman Regular"/>
+                <w:sz w:val="24"/>
+                <w:szCs w:val="24"/>
               </w:rPr>
               <w:t>Action</w:t>
             </w:r>
@@ -190,13 +204,15 @@
               <w:spacing w:before="0" w:after="80" w:line="300" w:lineRule="auto"/>
               <w:rPr>
                 <w:rFonts w:hint="default" w:ascii="Times New Roman Regular" w:hAnsi="Times New Roman Regular" w:cs="Times New Roman Regular"/>
-              </w:rPr>
-            </w:pPr>
-            <w:r>
-              <w:rPr>
-                <w:rFonts w:hint="default" w:ascii="Times New Roman Regular" w:hAnsi="Times New Roman Regular" w:eastAsia="微软雅黑" w:cs="Times New Roman Regular"/>
-                <w:sz w:val="22"/>
-                <w:szCs w:val="22"/>
+                <w:sz w:val="24"/>
+                <w:szCs w:val="24"/>
+              </w:rPr>
+            </w:pPr>
+            <w:r>
+              <w:rPr>
+                <w:rFonts w:hint="default" w:ascii="Times New Roman Regular" w:hAnsi="Times New Roman Regular" w:eastAsia="微软雅黑" w:cs="Times New Roman Regular"/>
+                <w:sz w:val="24"/>
+                <w:szCs w:val="24"/>
               </w:rPr>
               <w:t>模型产生 hash code，也可以决定样本权重、分支路由和检索预算。</w:t>
             </w:r>
@@ -214,13 +230,15 @@
               <w:spacing w:before="0" w:after="80" w:line="300" w:lineRule="auto"/>
               <w:rPr>
                 <w:rFonts w:hint="default" w:ascii="Times New Roman Regular" w:hAnsi="Times New Roman Regular" w:cs="Times New Roman Regular"/>
-              </w:rPr>
-            </w:pPr>
-            <w:r>
-              <w:rPr>
-                <w:rFonts w:hint="default" w:ascii="Times New Roman Regular" w:hAnsi="Times New Roman Regular" w:eastAsia="微软雅黑" w:cs="Times New Roman Regular"/>
-                <w:sz w:val="22"/>
-                <w:szCs w:val="22"/>
+                <w:sz w:val="24"/>
+                <w:szCs w:val="24"/>
+              </w:rPr>
+            </w:pPr>
+            <w:r>
+              <w:rPr>
+                <w:rFonts w:hint="default" w:ascii="Times New Roman Regular" w:hAnsi="Times New Roman Regular" w:eastAsia="微软雅黑" w:cs="Times New Roman Regular"/>
+                <w:sz w:val="24"/>
+                <w:szCs w:val="24"/>
               </w:rPr>
               <w:t>Feedback</w:t>
             </w:r>
@@ -236,13 +254,15 @@
               <w:spacing w:before="0" w:after="80" w:line="300" w:lineRule="auto"/>
               <w:rPr>
                 <w:rFonts w:hint="default" w:ascii="Times New Roman Regular" w:hAnsi="Times New Roman Regular" w:cs="Times New Roman Regular"/>
-              </w:rPr>
-            </w:pPr>
-            <w:r>
-              <w:rPr>
-                <w:rFonts w:hint="default" w:ascii="Times New Roman Regular" w:hAnsi="Times New Roman Regular" w:eastAsia="微软雅黑" w:cs="Times New Roman Regular"/>
-                <w:sz w:val="22"/>
-                <w:szCs w:val="22"/>
+                <w:sz w:val="24"/>
+                <w:szCs w:val="24"/>
+              </w:rPr>
+            </w:pPr>
+            <w:r>
+              <w:rPr>
+                <w:rFonts w:hint="default" w:ascii="Times New Roman Regular" w:hAnsi="Times New Roman Regular" w:eastAsia="微软雅黑" w:cs="Times New Roman Regular"/>
+                <w:sz w:val="24"/>
+                <w:szCs w:val="24"/>
               </w:rPr>
               <w:t>比较 planned retrieval 和 actual retrieval，找到漏检与误检。</w:t>
             </w:r>
@@ -260,13 +280,15 @@
               <w:spacing w:before="0" w:after="80" w:line="300" w:lineRule="auto"/>
               <w:rPr>
                 <w:rFonts w:hint="default" w:ascii="Times New Roman Regular" w:hAnsi="Times New Roman Regular" w:cs="Times New Roman Regular"/>
-              </w:rPr>
-            </w:pPr>
-            <w:r>
-              <w:rPr>
-                <w:rFonts w:hint="default" w:ascii="Times New Roman Regular" w:hAnsi="Times New Roman Regular" w:eastAsia="微软雅黑" w:cs="Times New Roman Regular"/>
-                <w:sz w:val="22"/>
-                <w:szCs w:val="22"/>
+                <w:sz w:val="24"/>
+                <w:szCs w:val="24"/>
+              </w:rPr>
+            </w:pPr>
+            <w:r>
+              <w:rPr>
+                <w:rFonts w:hint="default" w:ascii="Times New Roman Regular" w:hAnsi="Times New Roman Regular" w:eastAsia="微软雅黑" w:cs="Times New Roman Regular"/>
+                <w:sz w:val="24"/>
+                <w:szCs w:val="24"/>
               </w:rPr>
               <w:t>Memory</w:t>
             </w:r>
@@ -282,13 +304,15 @@
               <w:spacing w:before="0" w:after="80" w:line="300" w:lineRule="auto"/>
               <w:rPr>
                 <w:rFonts w:hint="default" w:ascii="Times New Roman Regular" w:hAnsi="Times New Roman Regular" w:cs="Times New Roman Regular"/>
-              </w:rPr>
-            </w:pPr>
-            <w:r>
-              <w:rPr>
-                <w:rFonts w:hint="default" w:ascii="Times New Roman Regular" w:hAnsi="Times New Roman Regular" w:eastAsia="微软雅黑" w:cs="Times New Roman Regular"/>
-                <w:sz w:val="22"/>
-                <w:szCs w:val="22"/>
+                <w:sz w:val="24"/>
+                <w:szCs w:val="24"/>
+              </w:rPr>
+            </w:pPr>
+            <w:r>
+              <w:rPr>
+                <w:rFonts w:hint="default" w:ascii="Times New Roman Regular" w:hAnsi="Times New Roman Regular" w:eastAsia="微软雅黑" w:cs="Times New Roman Regular"/>
+                <w:sz w:val="24"/>
+                <w:szCs w:val="24"/>
               </w:rPr>
               <w:t>把可靠边、失败边和历史检索状态写入外部邻居图。</w:t>
             </w:r>
@@ -306,13 +330,15 @@
               <w:spacing w:before="0" w:after="80" w:line="300" w:lineRule="auto"/>
               <w:rPr>
                 <w:rFonts w:hint="default" w:ascii="Times New Roman Regular" w:hAnsi="Times New Roman Regular" w:cs="Times New Roman Regular"/>
-              </w:rPr>
-            </w:pPr>
-            <w:r>
-              <w:rPr>
-                <w:rFonts w:hint="default" w:ascii="Times New Roman Regular" w:hAnsi="Times New Roman Regular" w:eastAsia="微软雅黑" w:cs="Times New Roman Regular"/>
-                <w:sz w:val="22"/>
-                <w:szCs w:val="22"/>
+                <w:sz w:val="24"/>
+                <w:szCs w:val="24"/>
+              </w:rPr>
+            </w:pPr>
+            <w:r>
+              <w:rPr>
+                <w:rFonts w:hint="default" w:ascii="Times New Roman Regular" w:hAnsi="Times New Roman Regular" w:eastAsia="微软雅黑" w:cs="Times New Roman Regular"/>
+                <w:sz w:val="24"/>
+                <w:szCs w:val="24"/>
               </w:rPr>
               <w:t>Adaptation</w:t>
             </w:r>
@@ -328,13 +354,15 @@
               <w:spacing w:before="0" w:after="80" w:line="300" w:lineRule="auto"/>
               <w:rPr>
                 <w:rFonts w:hint="default" w:ascii="Times New Roman Regular" w:hAnsi="Times New Roman Regular" w:cs="Times New Roman Regular"/>
-              </w:rPr>
-            </w:pPr>
-            <w:r>
-              <w:rPr>
-                <w:rFonts w:hint="default" w:ascii="Times New Roman Regular" w:hAnsi="Times New Roman Regular" w:eastAsia="微软雅黑" w:cs="Times New Roman Regular"/>
-                <w:sz w:val="22"/>
-                <w:szCs w:val="22"/>
+                <w:sz w:val="24"/>
+                <w:szCs w:val="24"/>
+              </w:rPr>
+            </w:pPr>
+            <w:r>
+              <w:rPr>
+                <w:rFonts w:hint="default" w:ascii="Times New Roman Regular" w:hAnsi="Times New Roman Regular" w:eastAsia="微软雅黑" w:cs="Times New Roman Regular"/>
+                <w:sz w:val="24"/>
+                <w:szCs w:val="24"/>
               </w:rPr>
               <w:t>根据反馈调整下一轮训练，而不是固定正负样本一跑到底。</w:t>
             </w:r>
@@ -347,6 +375,8 @@
         <w:spacing w:before="0" w:after="120" w:line="300" w:lineRule="auto"/>
         <w:rPr>
           <w:rFonts w:hint="default" w:ascii="Times New Roman Regular" w:hAnsi="Times New Roman Regular" w:cs="Times New Roman Regular"/>
+          <w:sz w:val="24"/>
+          <w:szCs w:val="24"/>
         </w:rPr>
       </w:pPr>
     </w:p>
@@ -357,8 +387,8 @@
           <w:rFonts w:hint="default" w:ascii="Times New Roman Regular" w:hAnsi="Times New Roman Regular" w:eastAsia="微软雅黑" w:cs="Times New Roman Regular"/>
           <w:b/>
           <w:bCs/>
-          <w:sz w:val="22"/>
-          <w:szCs w:val="22"/>
+          <w:sz w:val="24"/>
+          <w:szCs w:val="24"/>
         </w:rPr>
       </w:pPr>
       <w:r>
@@ -366,8 +396,8 @@
           <w:rFonts w:hint="default" w:ascii="Times New Roman Regular" w:hAnsi="Times New Roman Regular" w:eastAsia="微软雅黑" w:cs="Times New Roman Regular"/>
           <w:b/>
           <w:bCs/>
-          <w:sz w:val="22"/>
-          <w:szCs w:val="22"/>
+          <w:sz w:val="24"/>
+          <w:szCs w:val="24"/>
         </w:rPr>
         <w:t>核心概念：planned / actual / missed / false</w:t>
       </w:r>
@@ -407,6 +437,8 @@
               <w:spacing w:before="0" w:after="60" w:line="300" w:lineRule="auto"/>
               <w:rPr>
                 <w:rFonts w:hint="default" w:ascii="Times New Roman Regular" w:hAnsi="Times New Roman Regular" w:cs="Times New Roman Regular"/>
+                <w:sz w:val="24"/>
+                <w:szCs w:val="24"/>
               </w:rPr>
             </w:pPr>
             <w:r>
@@ -426,69 +458,71 @@
               <w:spacing w:before="0" w:after="60" w:line="280" w:lineRule="auto"/>
               <w:rPr>
                 <w:rFonts w:hint="default" w:ascii="Times New Roman Regular" w:hAnsi="Times New Roman Regular" w:cs="Times New Roman Regular"/>
-              </w:rPr>
-            </w:pPr>
-            <w:r>
-              <w:rPr>
-                <w:rFonts w:hint="default" w:ascii="Times New Roman Regular" w:hAnsi="Times New Roman Regular" w:eastAsia="微软雅黑" w:cs="Times New Roman Regular"/>
-                <w:sz w:val="20"/>
-                <w:szCs w:val="20"/>
+                <w:sz w:val="24"/>
+                <w:szCs w:val="24"/>
+              </w:rPr>
+            </w:pPr>
+            <w:r>
+              <w:rPr>
+                <w:rFonts w:hint="default" w:ascii="Times New Roman Regular" w:hAnsi="Times New Roman Regular" w:eastAsia="微软雅黑" w:cs="Times New Roman Regular"/>
+                <w:sz w:val="24"/>
+                <w:szCs w:val="24"/>
               </w:rPr>
               <w:t>planned(i): 系统认为样本 i 应该检索到的邻居</w:t>
             </w:r>
             <w:r>
               <w:rPr>
                 <w:rFonts w:hint="default" w:ascii="Times New Roman Regular" w:hAnsi="Times New Roman Regular" w:eastAsia="微软雅黑" w:cs="Times New Roman Regular"/>
-                <w:sz w:val="20"/>
-                <w:szCs w:val="20"/>
+                <w:sz w:val="24"/>
+                <w:szCs w:val="24"/>
               </w:rPr>
               <w:br w:type="textWrapping"/>
             </w:r>
             <w:r>
               <w:rPr>
                 <w:rFonts w:hint="default" w:ascii="Times New Roman Regular" w:hAnsi="Times New Roman Regular" w:eastAsia="微软雅黑" w:cs="Times New Roman Regular"/>
-                <w:sz w:val="20"/>
-                <w:szCs w:val="20"/>
+                <w:sz w:val="24"/>
+                <w:szCs w:val="24"/>
               </w:rPr>
               <w:t>actual(i): 当前 hash code 实际检索到的邻居</w:t>
             </w:r>
             <w:r>
               <w:rPr>
                 <w:rFonts w:hint="default" w:ascii="Times New Roman Regular" w:hAnsi="Times New Roman Regular" w:eastAsia="微软雅黑" w:cs="Times New Roman Regular"/>
-                <w:sz w:val="20"/>
-                <w:szCs w:val="20"/>
+                <w:sz w:val="24"/>
+                <w:szCs w:val="24"/>
               </w:rPr>
               <w:br w:type="textWrapping"/>
             </w:r>
             <w:r>
               <w:rPr>
                 <w:rFonts w:hint="default" w:ascii="Times New Roman Regular" w:hAnsi="Times New Roman Regular" w:eastAsia="微软雅黑" w:cs="Times New Roman Regular"/>
-                <w:sz w:val="20"/>
-                <w:szCs w:val="20"/>
+                <w:sz w:val="24"/>
+                <w:szCs w:val="24"/>
               </w:rPr>
               <w:br w:type="textWrapping"/>
             </w:r>
             <w:r>
               <w:rPr>
                 <w:rFonts w:hint="default" w:ascii="Times New Roman Regular" w:hAnsi="Times New Roman Regular" w:eastAsia="微软雅黑" w:cs="Times New Roman Regular"/>
-                <w:sz w:val="20"/>
-                <w:szCs w:val="20"/>
+                <w:sz w:val="24"/>
+                <w:szCs w:val="24"/>
               </w:rPr>
               <w:t>missed = planned - actual   # 该找没找到，hard positive</w:t>
             </w:r>
             <w:r>
               <w:rPr>
                 <w:rFonts w:hint="default" w:ascii="Times New Roman Regular" w:hAnsi="Times New Roman Regular" w:eastAsia="微软雅黑" w:cs="Times New Roman Regular"/>
-                <w:sz w:val="20"/>
-                <w:szCs w:val="20"/>
+                <w:sz w:val="24"/>
+                <w:szCs w:val="24"/>
               </w:rPr>
               <w:br w:type="textWrapping"/>
             </w:r>
             <w:r>
               <w:rPr>
                 <w:rFonts w:hint="default" w:ascii="Times New Roman Regular" w:hAnsi="Times New Roman Regular" w:eastAsia="微软雅黑" w:cs="Times New Roman Regular"/>
-                <w:sz w:val="20"/>
-                <w:szCs w:val="20"/>
+                <w:sz w:val="24"/>
+                <w:szCs w:val="24"/>
               </w:rPr>
               <w:t>false  = actual  - planned  # 不该找却找到，hard negative</w:t>
             </w:r>
@@ -498,6 +532,8 @@
               <w:spacing w:before="0" w:after="40" w:line="300" w:lineRule="auto"/>
               <w:rPr>
                 <w:rFonts w:hint="default" w:ascii="Times New Roman Regular" w:hAnsi="Times New Roman Regular" w:cs="Times New Roman Regular"/>
+                <w:sz w:val="24"/>
+                <w:szCs w:val="24"/>
               </w:rPr>
             </w:pPr>
             <w:r>
@@ -506,8 +542,8 @@
                 <w:i/>
                 <w:iCs/>
                 <w:color w:val="555555"/>
-                <w:sz w:val="20"/>
-                <w:szCs w:val="20"/>
+                <w:sz w:val="24"/>
+                <w:szCs w:val="24"/>
               </w:rPr>
               <w:t>planned 是参考答案，actual 是学生交卷；missed 和 false 就是模型当前最需要纠正的错误。</w:t>
             </w:r>
@@ -520,6 +556,8 @@
         <w:spacing w:before="0" w:after="120" w:line="300" w:lineRule="auto"/>
         <w:rPr>
           <w:rFonts w:hint="default" w:ascii="Times New Roman Regular" w:hAnsi="Times New Roman Regular" w:cs="Times New Roman Regular"/>
+          <w:sz w:val="24"/>
+          <w:szCs w:val="24"/>
         </w:rPr>
       </w:pPr>
     </w:p>
@@ -528,23 +566,25 @@
         <w:spacing w:before="0" w:after="120" w:line="300" w:lineRule="auto"/>
         <w:rPr>
           <w:rFonts w:hint="default" w:ascii="Times New Roman Regular" w:hAnsi="Times New Roman Regular" w:eastAsia="微软雅黑" w:cs="Times New Roman Regular"/>
-          <w:sz w:val="22"/>
-          <w:szCs w:val="22"/>
+          <w:b/>
+          <w:bCs/>
+          <w:sz w:val="24"/>
+          <w:szCs w:val="24"/>
         </w:rPr>
       </w:pPr>
       <w:r>
         <w:rPr>
           <w:rFonts w:hint="default" w:ascii="Times New Roman Regular" w:hAnsi="Times New Roman Regular" w:eastAsia="微软雅黑" w:cs="Times New Roman Regular"/>
-          <w:sz w:val="22"/>
-          <w:szCs w:val="22"/>
+          <w:sz w:val="24"/>
+          <w:szCs w:val="24"/>
         </w:rPr>
         <w:t>missed/false 不</w:t>
       </w:r>
       <w:r>
         <w:rPr>
           <w:rFonts w:hint="eastAsia" w:ascii="Times New Roman Regular" w:hAnsi="Times New Roman Regular" w:eastAsia="微软雅黑" w:cs="Times New Roman Regular"/>
-          <w:sz w:val="22"/>
-          <w:szCs w:val="22"/>
+          <w:sz w:val="24"/>
+          <w:szCs w:val="24"/>
           <w:lang w:val="en-US" w:eastAsia="zh-CN"/>
         </w:rPr>
         <w:t>是</w:t>
@@ -552,48 +592,30 @@
       <w:r>
         <w:rPr>
           <w:rFonts w:hint="default" w:ascii="Times New Roman Regular" w:hAnsi="Times New Roman Regular" w:eastAsia="微软雅黑" w:cs="Times New Roman Regular"/>
-          <w:sz w:val="22"/>
-          <w:szCs w:val="22"/>
+          <w:sz w:val="24"/>
+          <w:szCs w:val="24"/>
         </w:rPr>
         <w:t>两个普通 loss，而是检索系统自己的行为反馈。训练目标不再只问“样本是否相似”，而是问“当前检索系统错在哪里”。</w:t>
       </w:r>
-    </w:p>
-    <w:p>
-      <w:pPr>
-        <w:spacing w:before="0" w:after="120" w:line="300" w:lineRule="auto"/>
-        <w:rPr>
-          <w:rFonts w:hint="default" w:ascii="Times New Roman Regular" w:hAnsi="Times New Roman Regular" w:cs="Times New Roman Regular"/>
-        </w:rPr>
-      </w:pPr>
-    </w:p>
-    <w:p>
-      <w:pPr>
-        <w:spacing w:before="0" w:after="120" w:line="300" w:lineRule="auto"/>
+      <w:bookmarkStart w:id="0" w:name="_GoBack"/>
+      <w:bookmarkEnd w:id="0"/>
+      <w:r>
         <w:rPr>
           <w:rFonts w:hint="default" w:ascii="Times New Roman Regular" w:hAnsi="Times New Roman Regular" w:eastAsia="微软雅黑" w:cs="Times New Roman Regular"/>
           <w:b/>
           <w:bCs/>
-          <w:sz w:val="22"/>
-          <w:szCs w:val="22"/>
-        </w:rPr>
-      </w:pPr>
+          <w:sz w:val="24"/>
+          <w:szCs w:val="24"/>
+        </w:rPr>
+        <w:br w:type="page"/>
+      </w:r>
       <w:r>
         <w:rPr>
           <w:rFonts w:hint="default" w:ascii="Times New Roman Regular" w:hAnsi="Times New Roman Regular" w:eastAsia="微软雅黑" w:cs="Times New Roman Regular"/>
           <w:b/>
           <w:bCs/>
-          <w:sz w:val="22"/>
-          <w:szCs w:val="22"/>
-        </w:rPr>
-        <w:br w:type="page"/>
-      </w:r>
-      <w:r>
-        <w:rPr>
-          <w:rFonts w:hint="default" w:ascii="Times New Roman Regular" w:hAnsi="Times New Roman Regular" w:eastAsia="微软雅黑" w:cs="Times New Roman Regular"/>
-          <w:b/>
-          <w:bCs/>
-          <w:sz w:val="22"/>
-          <w:szCs w:val="22"/>
+          <w:sz w:val="24"/>
+          <w:szCs w:val="24"/>
         </w:rPr>
         <w:t>双层结构：内层优化器 + 外层 agent</w:t>
       </w:r>
@@ -603,21 +625,23 @@
         <w:spacing w:before="0" w:after="120" w:line="300" w:lineRule="auto"/>
         <w:rPr>
           <w:rFonts w:hint="default" w:ascii="Times New Roman Regular" w:hAnsi="Times New Roman Regular" w:cs="Times New Roman Regular"/>
+          <w:sz w:val="24"/>
+          <w:szCs w:val="24"/>
         </w:rPr>
       </w:pPr>
       <w:r>
         <w:rPr>
           <w:rFonts w:hint="default" w:ascii="Times New Roman Regular" w:hAnsi="Times New Roman Regular" w:eastAsia="微软雅黑" w:cs="Times New Roman Regular"/>
-          <w:sz w:val="22"/>
-          <w:szCs w:val="22"/>
+          <w:sz w:val="24"/>
+          <w:szCs w:val="24"/>
         </w:rPr>
         <w:t>不是用 agent 替代训练</w:t>
       </w:r>
       <w:r>
         <w:rPr>
           <w:rFonts w:hint="eastAsia" w:ascii="Times New Roman Regular" w:hAnsi="Times New Roman Regular" w:eastAsia="微软雅黑" w:cs="Times New Roman Regular"/>
-          <w:sz w:val="22"/>
-          <w:szCs w:val="22"/>
+          <w:sz w:val="24"/>
+          <w:szCs w:val="24"/>
           <w:lang w:eastAsia="zh-CN"/>
         </w:rPr>
         <w:t>，</w:t>
@@ -625,8 +649,8 @@
       <w:r>
         <w:rPr>
           <w:rFonts w:hint="default" w:ascii="Times New Roman Regular" w:hAnsi="Times New Roman Regular" w:eastAsia="微软雅黑" w:cs="Times New Roman Regular"/>
-          <w:sz w:val="22"/>
-          <w:szCs w:val="22"/>
+          <w:sz w:val="24"/>
+          <w:szCs w:val="24"/>
         </w:rPr>
         <w:t>SGD/Adam 仍然负责连续参数更新，agent 负责训练过程的离散控制和反馈解释。</w:t>
       </w:r>
@@ -640,12 +664,16 @@
         <w:jc w:val="left"/>
         <w:rPr>
           <w:rFonts w:hint="eastAsia" w:eastAsia="宋体"/>
+          <w:sz w:val="24"/>
+          <w:szCs w:val="24"/>
           <w:lang w:eastAsia="zh-CN"/>
         </w:rPr>
       </w:pPr>
       <w:r>
         <w:rPr>
           <w:rFonts w:hint="eastAsia" w:eastAsia="宋体"/>
+          <w:sz w:val="24"/>
+          <w:szCs w:val="24"/>
           <w:lang w:eastAsia="zh-CN"/>
         </w:rPr>
         <w:drawing>
@@ -692,6 +720,8 @@
         <w:spacing w:before="0" w:after="120" w:line="300" w:lineRule="auto"/>
         <w:rPr>
           <w:rFonts w:hint="default" w:ascii="Times New Roman Regular" w:hAnsi="Times New Roman Regular" w:cs="Times New Roman Regular"/>
+          <w:sz w:val="24"/>
+          <w:szCs w:val="24"/>
         </w:rPr>
       </w:pPr>
     </w:p>
@@ -733,6 +763,8 @@
               <w:spacing w:before="0" w:after="40" w:line="300" w:lineRule="auto"/>
               <w:rPr>
                 <w:rFonts w:hint="default" w:ascii="Times New Roman Regular" w:hAnsi="Times New Roman Regular" w:cs="Times New Roman Regular"/>
+                <w:sz w:val="24"/>
+                <w:szCs w:val="24"/>
               </w:rPr>
             </w:pPr>
             <w:r>
@@ -741,8 +773,8 @@
                 <w:b/>
                 <w:bCs/>
                 <w:color w:val="1F4D78"/>
-                <w:sz w:val="22"/>
-                <w:szCs w:val="22"/>
+                <w:sz w:val="24"/>
+                <w:szCs w:val="24"/>
               </w:rPr>
               <w:t>层次</w:t>
             </w:r>
@@ -759,6 +791,8 @@
               <w:spacing w:before="0" w:after="40" w:line="300" w:lineRule="auto"/>
               <w:rPr>
                 <w:rFonts w:hint="default" w:ascii="Times New Roman Regular" w:hAnsi="Times New Roman Regular" w:cs="Times New Roman Regular"/>
+                <w:sz w:val="24"/>
+                <w:szCs w:val="24"/>
               </w:rPr>
             </w:pPr>
             <w:r>
@@ -767,8 +801,8 @@
                 <w:b/>
                 <w:bCs/>
                 <w:color w:val="1F4D78"/>
-                <w:sz w:val="22"/>
-                <w:szCs w:val="22"/>
+                <w:sz w:val="24"/>
+                <w:szCs w:val="24"/>
               </w:rPr>
               <w:t>职责</w:t>
             </w:r>
@@ -785,6 +819,8 @@
               <w:spacing w:before="0" w:after="40" w:line="300" w:lineRule="auto"/>
               <w:rPr>
                 <w:rFonts w:hint="default" w:ascii="Times New Roman Regular" w:hAnsi="Times New Roman Regular" w:cs="Times New Roman Regular"/>
+                <w:sz w:val="24"/>
+                <w:szCs w:val="24"/>
               </w:rPr>
             </w:pPr>
           </w:p>
@@ -801,13 +837,15 @@
               <w:spacing w:before="0" w:after="80" w:line="300" w:lineRule="auto"/>
               <w:rPr>
                 <w:rFonts w:hint="default" w:ascii="Times New Roman Regular" w:hAnsi="Times New Roman Regular" w:cs="Times New Roman Regular"/>
-              </w:rPr>
-            </w:pPr>
-            <w:r>
-              <w:rPr>
-                <w:rFonts w:hint="default" w:ascii="Times New Roman Regular" w:hAnsi="Times New Roman Regular" w:eastAsia="微软雅黑" w:cs="Times New Roman Regular"/>
-                <w:sz w:val="22"/>
-                <w:szCs w:val="22"/>
+                <w:sz w:val="24"/>
+                <w:szCs w:val="24"/>
+              </w:rPr>
+            </w:pPr>
+            <w:r>
+              <w:rPr>
+                <w:rFonts w:hint="default" w:ascii="Times New Roman Regular" w:hAnsi="Times New Roman Regular" w:eastAsia="微软雅黑" w:cs="Times New Roman Regular"/>
+                <w:sz w:val="24"/>
+                <w:szCs w:val="24"/>
               </w:rPr>
               <w:t>Inner optimizer</w:t>
             </w:r>
@@ -823,13 +861,15 @@
               <w:spacing w:before="0" w:after="80" w:line="300" w:lineRule="auto"/>
               <w:rPr>
                 <w:rFonts w:hint="default" w:ascii="Times New Roman Regular" w:hAnsi="Times New Roman Regular" w:cs="Times New Roman Regular"/>
-              </w:rPr>
-            </w:pPr>
-            <w:r>
-              <w:rPr>
-                <w:rFonts w:hint="default" w:ascii="Times New Roman Regular" w:hAnsi="Times New Roman Regular" w:eastAsia="微软雅黑" w:cs="Times New Roman Regular"/>
-                <w:sz w:val="22"/>
-                <w:szCs w:val="22"/>
+                <w:sz w:val="24"/>
+                <w:szCs w:val="24"/>
+              </w:rPr>
+            </w:pPr>
+            <w:r>
+              <w:rPr>
+                <w:rFonts w:hint="default" w:ascii="Times New Roman Regular" w:hAnsi="Times New Roman Regular" w:eastAsia="微软雅黑" w:cs="Times New Roman Regular"/>
+                <w:sz w:val="24"/>
+                <w:szCs w:val="24"/>
               </w:rPr>
               <w:t>编码器、哈希头、对比目标、反向传播</w:t>
             </w:r>
@@ -845,13 +885,15 @@
               <w:spacing w:before="0" w:after="80" w:line="300" w:lineRule="auto"/>
               <w:rPr>
                 <w:rFonts w:hint="default" w:ascii="Times New Roman Regular" w:hAnsi="Times New Roman Regular" w:cs="Times New Roman Regular"/>
-              </w:rPr>
-            </w:pPr>
-            <w:r>
-              <w:rPr>
-                <w:rFonts w:hint="default" w:ascii="Times New Roman Regular" w:hAnsi="Times New Roman Regular" w:eastAsia="微软雅黑" w:cs="Times New Roman Regular"/>
-                <w:sz w:val="22"/>
-                <w:szCs w:val="22"/>
+                <w:sz w:val="24"/>
+                <w:szCs w:val="24"/>
+              </w:rPr>
+            </w:pPr>
+            <w:r>
+              <w:rPr>
+                <w:rFonts w:hint="default" w:ascii="Times New Roman Regular" w:hAnsi="Times New Roman Regular" w:eastAsia="微软雅黑" w:cs="Times New Roman Regular"/>
+                <w:sz w:val="24"/>
+                <w:szCs w:val="24"/>
               </w:rPr>
               <w:t>不是 agent，不做策略决策</w:t>
             </w:r>
@@ -869,13 +911,15 @@
               <w:spacing w:before="0" w:after="80" w:line="300" w:lineRule="auto"/>
               <w:rPr>
                 <w:rFonts w:hint="default" w:ascii="Times New Roman Regular" w:hAnsi="Times New Roman Regular" w:cs="Times New Roman Regular"/>
-              </w:rPr>
-            </w:pPr>
-            <w:r>
-              <w:rPr>
-                <w:rFonts w:hint="default" w:ascii="Times New Roman Regular" w:hAnsi="Times New Roman Regular" w:eastAsia="微软雅黑" w:cs="Times New Roman Regular"/>
-                <w:sz w:val="22"/>
-                <w:szCs w:val="22"/>
+                <w:sz w:val="24"/>
+                <w:szCs w:val="24"/>
+              </w:rPr>
+            </w:pPr>
+            <w:r>
+              <w:rPr>
+                <w:rFonts w:hint="default" w:ascii="Times New Roman Regular" w:hAnsi="Times New Roman Regular" w:eastAsia="微软雅黑" w:cs="Times New Roman Regular"/>
+                <w:sz w:val="24"/>
+                <w:szCs w:val="24"/>
               </w:rPr>
               <w:t>Outer agent</w:t>
             </w:r>
@@ -891,13 +935,15 @@
               <w:spacing w:before="0" w:after="80" w:line="300" w:lineRule="auto"/>
               <w:rPr>
                 <w:rFonts w:hint="default" w:ascii="Times New Roman Regular" w:hAnsi="Times New Roman Regular" w:cs="Times New Roman Regular"/>
-              </w:rPr>
-            </w:pPr>
-            <w:r>
-              <w:rPr>
-                <w:rFonts w:hint="default" w:ascii="Times New Roman Regular" w:hAnsi="Times New Roman Regular" w:eastAsia="微软雅黑" w:cs="Times New Roman Regular"/>
-                <w:sz w:val="22"/>
-                <w:szCs w:val="22"/>
+                <w:sz w:val="24"/>
+                <w:szCs w:val="24"/>
+              </w:rPr>
+            </w:pPr>
+            <w:r>
+              <w:rPr>
+                <w:rFonts w:hint="default" w:ascii="Times New Roman Regular" w:hAnsi="Times New Roman Regular" w:eastAsia="微软雅黑" w:cs="Times New Roman Regular"/>
+                <w:sz w:val="24"/>
+                <w:szCs w:val="24"/>
               </w:rPr>
               <w:t>检索反馈解释、memory 更新、样本权重、分支路由、停止策略</w:t>
             </w:r>
@@ -913,13 +959,15 @@
               <w:spacing w:before="0" w:after="80" w:line="300" w:lineRule="auto"/>
               <w:rPr>
                 <w:rFonts w:hint="default" w:ascii="Times New Roman Regular" w:hAnsi="Times New Roman Regular" w:cs="Times New Roman Regular"/>
-              </w:rPr>
-            </w:pPr>
-            <w:r>
-              <w:rPr>
-                <w:rFonts w:hint="default" w:ascii="Times New Roman Regular" w:hAnsi="Times New Roman Regular" w:eastAsia="微软雅黑" w:cs="Times New Roman Regular"/>
-                <w:sz w:val="22"/>
-                <w:szCs w:val="22"/>
+                <w:sz w:val="24"/>
+                <w:szCs w:val="24"/>
+              </w:rPr>
+            </w:pPr>
+            <w:r>
+              <w:rPr>
+                <w:rFonts w:hint="default" w:ascii="Times New Roman Regular" w:hAnsi="Times New Roman Regular" w:eastAsia="微软雅黑" w:cs="Times New Roman Regular"/>
+                <w:sz w:val="24"/>
+                <w:szCs w:val="24"/>
               </w:rPr>
               <w:t>不是 LLM，不直接输出哈希码</w:t>
             </w:r>
@@ -932,6 +980,8 @@
         <w:spacing w:before="0" w:after="120" w:line="300" w:lineRule="auto"/>
         <w:rPr>
           <w:rFonts w:hint="default" w:ascii="Times New Roman Regular" w:hAnsi="Times New Roman Regular" w:cs="Times New Roman Regular"/>
+          <w:sz w:val="24"/>
+          <w:szCs w:val="24"/>
         </w:rPr>
       </w:pPr>
     </w:p>
@@ -939,206 +989,81 @@
       <w:pPr>
         <w:spacing w:before="0" w:after="120" w:line="300" w:lineRule="auto"/>
         <w:ind w:firstLine="500" w:firstLineChars="0"/>
+        <w:jc w:val="left"/>
         <w:rPr>
           <w:rFonts w:hint="default" w:ascii="Times New Roman Regular" w:hAnsi="Times New Roman Regular" w:cs="Times New Roman Regular"/>
+          <w:sz w:val="24"/>
+          <w:szCs w:val="24"/>
         </w:rPr>
       </w:pPr>
       <w:r>
         <w:rPr>
           <w:rFonts w:hint="default" w:ascii="Times New Roman Regular" w:hAnsi="Times New Roman Regular" w:eastAsia="微软雅黑" w:cs="Times New Roman Regular"/>
-          <w:sz w:val="22"/>
-          <w:szCs w:val="22"/>
+          <w:sz w:val="24"/>
+          <w:szCs w:val="24"/>
         </w:rPr>
         <w:t>视频哈希不只是静态图像检索。它同时依赖内容语义和时序动态，所以 agentic retrieval 可以进一步解释某个检索错误来自哪个分支。</w:t>
       </w:r>
-    </w:p>
-    <w:tbl>
-      <w:tblPr>
-        <w:tblStyle w:val="2"/>
-        <w:tblW w:w="9360" w:type="dxa"/>
-        <w:tblInd w:w="120" w:type="dxa"/>
-        <w:tblBorders>
-          <w:top w:val="single" w:color="B7C4D6" w:sz="4" w:space="0"/>
-          <w:left w:val="single" w:color="B7C4D6" w:sz="4" w:space="0"/>
-          <w:bottom w:val="single" w:color="B7C4D6" w:sz="4" w:space="0"/>
-          <w:right w:val="single" w:color="B7C4D6" w:sz="4" w:space="0"/>
-          <w:insideH w:val="single" w:color="D9E2EF" w:sz="4" w:space="0"/>
-          <w:insideV w:val="single" w:color="D9E2EF" w:sz="4" w:space="0"/>
-        </w:tblBorders>
-        <w:tblLayout w:type="fixed"/>
-        <w:tblCellMar>
-          <w:top w:w="80" w:type="dxa"/>
-          <w:left w:w="120" w:type="dxa"/>
-          <w:bottom w:w="80" w:type="dxa"/>
-          <w:right w:w="120" w:type="dxa"/>
-        </w:tblCellMar>
-      </w:tblPr>
-      <w:tblGrid>
-        <w:gridCol w:w="9360"/>
-      </w:tblGrid>
-      <w:tr>
-        <w:tc>
-          <w:tcPr>
-            <w:tcW w:w="9360" w:type="dxa"/>
-            <w:vAlign w:val="center"/>
-          </w:tcPr>
-          <w:p>
-            <w:pPr>
-              <w:spacing w:before="0" w:after="60" w:line="300" w:lineRule="auto"/>
-              <w:rPr>
-                <w:rFonts w:hint="default" w:ascii="Times New Roman Regular" w:hAnsi="Times New Roman Regular" w:cs="Times New Roman Regular"/>
-              </w:rPr>
-            </w:pPr>
-            <w:r>
-              <w:rPr>
-                <w:rFonts w:hint="default" w:ascii="Times New Roman Regular" w:hAnsi="Times New Roman Regular" w:eastAsia="微软雅黑" w:cs="Times New Roman Regular"/>
-                <w:b/>
-                <w:bCs/>
-                <w:color w:val="1F4D78"/>
-                <w:sz w:val="24"/>
-                <w:szCs w:val="24"/>
-              </w:rPr>
-              <w:t>slow/fast 分支与 feedback routing</w:t>
-            </w:r>
-          </w:p>
-          <w:p>
-            <w:pPr>
-              <w:spacing w:before="0" w:after="60" w:line="280" w:lineRule="auto"/>
-              <w:rPr>
-                <w:rFonts w:hint="default" w:ascii="Times New Roman Regular" w:hAnsi="Times New Roman Regular" w:cs="Times New Roman Regular"/>
-              </w:rPr>
-            </w:pPr>
-            <w:r>
-              <w:rPr>
-                <w:rFonts w:hint="default" w:ascii="Times New Roman Regular" w:hAnsi="Times New Roman Regular" w:eastAsia="微软雅黑" w:cs="Times New Roman Regular"/>
-                <w:sz w:val="20"/>
-                <w:szCs w:val="20"/>
-              </w:rPr>
-              <w:t>video features</w:t>
-            </w:r>
-            <w:r>
-              <w:rPr>
-                <w:rFonts w:hint="default" w:ascii="Times New Roman Regular" w:hAnsi="Times New Roman Regular" w:eastAsia="微软雅黑" w:cs="Times New Roman Regular"/>
-                <w:sz w:val="20"/>
-                <w:szCs w:val="20"/>
-              </w:rPr>
-              <w:br w:type="textWrapping"/>
-            </w:r>
-            <w:r>
-              <w:rPr>
-                <w:rFonts w:hint="default" w:ascii="Times New Roman Regular" w:hAnsi="Times New Roman Regular" w:eastAsia="微软雅黑" w:cs="Times New Roman Regular"/>
-                <w:sz w:val="20"/>
-                <w:szCs w:val="20"/>
-              </w:rPr>
-              <w:t xml:space="preserve">   ├─ slow semantic branch -&gt; semantic subcode u_s</w:t>
-            </w:r>
-            <w:r>
-              <w:rPr>
-                <w:rFonts w:hint="default" w:ascii="Times New Roman Regular" w:hAnsi="Times New Roman Regular" w:eastAsia="微软雅黑" w:cs="Times New Roman Regular"/>
-                <w:sz w:val="20"/>
-                <w:szCs w:val="20"/>
-              </w:rPr>
-              <w:br w:type="textWrapping"/>
-            </w:r>
-            <w:r>
-              <w:rPr>
-                <w:rFonts w:hint="default" w:ascii="Times New Roman Regular" w:hAnsi="Times New Roman Regular" w:eastAsia="微软雅黑" w:cs="Times New Roman Regular"/>
-                <w:sz w:val="20"/>
-                <w:szCs w:val="20"/>
-              </w:rPr>
-              <w:t xml:space="preserve">   └─ fast temporal branch -&gt; temporal subcode u_f</w:t>
-            </w:r>
-            <w:r>
-              <w:rPr>
-                <w:rFonts w:hint="default" w:ascii="Times New Roman Regular" w:hAnsi="Times New Roman Regular" w:eastAsia="微软雅黑" w:cs="Times New Roman Regular"/>
-                <w:sz w:val="20"/>
-                <w:szCs w:val="20"/>
-              </w:rPr>
-              <w:br w:type="textWrapping"/>
-            </w:r>
-            <w:r>
-              <w:rPr>
-                <w:rFonts w:hint="default" w:ascii="Times New Roman Regular" w:hAnsi="Times New Roman Regular" w:eastAsia="微软雅黑" w:cs="Times New Roman Regular"/>
-                <w:sz w:val="20"/>
-                <w:szCs w:val="20"/>
-              </w:rPr>
-              <w:br w:type="textWrapping"/>
-            </w:r>
-            <w:r>
-              <w:rPr>
-                <w:rFonts w:hint="default" w:ascii="Times New Roman Regular" w:hAnsi="Times New Roman Regular" w:eastAsia="微软雅黑" w:cs="Times New Roman Regular"/>
-                <w:sz w:val="20"/>
-                <w:szCs w:val="20"/>
-              </w:rPr>
-              <w:t>retrieval feedback -&gt; branch attribution -&gt; fusion / routing gate</w:t>
-            </w:r>
-            <w:r>
-              <w:rPr>
-                <w:rFonts w:hint="default" w:ascii="Times New Roman Regular" w:hAnsi="Times New Roman Regular" w:eastAsia="微软雅黑" w:cs="Times New Roman Regular"/>
-                <w:sz w:val="20"/>
-                <w:szCs w:val="20"/>
-              </w:rPr>
-              <w:br w:type="textWrapping"/>
-            </w:r>
-            <w:r>
-              <w:rPr>
-                <w:rFonts w:hint="default" w:ascii="Times New Roman Regular" w:hAnsi="Times New Roman Regular" w:eastAsia="微软雅黑" w:cs="Times New Roman Regular"/>
-                <w:sz w:val="20"/>
-                <w:szCs w:val="20"/>
-              </w:rPr>
-              <w:br w:type="textWrapping"/>
-            </w:r>
-            <w:r>
-              <w:rPr>
-                <w:rFonts w:hint="default" w:ascii="Times New Roman Regular" w:hAnsi="Times New Roman Regular" w:eastAsia="微软雅黑" w:cs="Times New Roman Regular"/>
-                <w:sz w:val="20"/>
-                <w:szCs w:val="20"/>
-              </w:rPr>
-              <w:t>final binary code: [u_s ; u_f]</w:t>
-            </w:r>
-          </w:p>
-          <w:p>
-            <w:pPr>
-              <w:spacing w:before="0" w:after="40" w:line="300" w:lineRule="auto"/>
-              <w:rPr>
-                <w:rFonts w:hint="default" w:ascii="Times New Roman Regular" w:hAnsi="Times New Roman Regular" w:cs="Times New Roman Regular"/>
-              </w:rPr>
-            </w:pPr>
-            <w:r>
-              <w:rPr>
-                <w:rFonts w:hint="default" w:ascii="Times New Roman Regular" w:hAnsi="Times New Roman Regular" w:eastAsia="微软雅黑" w:cs="Times New Roman Regular"/>
-                <w:i/>
-                <w:iCs/>
-                <w:color w:val="555555"/>
-                <w:sz w:val="20"/>
-                <w:szCs w:val="20"/>
-              </w:rPr>
-              <w:t>如果误检来自静态内容太像但动作不同，就提高 fast 分支责任；如果漏检来自语义没有传到 hash code，就加强 slow 分支。</w:t>
-            </w:r>
-          </w:p>
-        </w:tc>
-      </w:tr>
-    </w:tbl>
-    <w:p>
-      <w:pPr>
-        <w:spacing w:before="0" w:after="120" w:line="300" w:lineRule="auto"/>
-        <w:rPr>
-          <w:rFonts w:hint="default" w:ascii="Times New Roman Regular" w:hAnsi="Times New Roman Regular" w:cs="Times New Roman Regular"/>
-        </w:rPr>
-      </w:pPr>
+      <w:r>
+        <w:rPr>
+          <w:rFonts w:hint="eastAsia" w:ascii="Times New Roman Regular" w:hAnsi="Times New Roman Regular" w:eastAsia="微软雅黑" w:cs="Times New Roman Regular"/>
+          <w:sz w:val="24"/>
+          <w:szCs w:val="24"/>
+          <w:lang w:eastAsia="zh-CN"/>
+        </w:rPr>
+        <w:drawing>
+          <wp:inline distT="0" distB="0" distL="114300" distR="114300">
+            <wp:extent cx="5940425" cy="3343275"/>
+            <wp:effectExtent l="0" t="0" r="3175" b="9525"/>
+            <wp:docPr id="6" name="图片 6" descr="ChatGPT Image 2026年7月2日 13_11_56"/>
+            <wp:cNvGraphicFramePr>
+              <a:graphicFrameLocks xmlns:a="http://schemas.openxmlformats.org/drawingml/2006/main" noChangeAspect="1"/>
+            </wp:cNvGraphicFramePr>
+            <a:graphic xmlns:a="http://schemas.openxmlformats.org/drawingml/2006/main">
+              <a:graphicData uri="http://schemas.openxmlformats.org/drawingml/2006/picture">
+                <pic:pic xmlns:pic="http://schemas.openxmlformats.org/drawingml/2006/picture">
+                  <pic:nvPicPr>
+                    <pic:cNvPr id="6" name="图片 6" descr="ChatGPT Image 2026年7月2日 13_11_56"/>
+                    <pic:cNvPicPr>
+                      <a:picLocks noChangeAspect="1"/>
+                    </pic:cNvPicPr>
+                  </pic:nvPicPr>
+                  <pic:blipFill>
+                    <a:blip r:embed="rId6"/>
+                    <a:stretch>
+                      <a:fillRect/>
+                    </a:stretch>
+                  </pic:blipFill>
+                  <pic:spPr>
+                    <a:xfrm>
+                      <a:off x="0" y="0"/>
+                      <a:ext cx="5940425" cy="3343275"/>
+                    </a:xfrm>
+                    <a:prstGeom prst="rect">
+                      <a:avLst/>
+                    </a:prstGeom>
+                  </pic:spPr>
+                </pic:pic>
+              </a:graphicData>
+            </a:graphic>
+          </wp:inline>
+        </w:drawing>
+      </w:r>
     </w:p>
     <w:p>
       <w:pPr>
         <w:spacing w:before="0" w:after="120" w:line="300" w:lineRule="auto"/>
         <w:rPr>
           <w:rFonts w:hint="default" w:ascii="Times New Roman Regular" w:hAnsi="Times New Roman Regular" w:cs="Times New Roman Regular"/>
+          <w:sz w:val="24"/>
+          <w:szCs w:val="24"/>
         </w:rPr>
       </w:pPr>
       <w:r>
         <w:rPr>
           <w:rFonts w:hint="default" w:ascii="Times New Roman Regular" w:hAnsi="Times New Roman Regular" w:eastAsia="微软雅黑" w:cs="Times New Roman Regular"/>
-          <w:sz w:val="22"/>
-          <w:szCs w:val="22"/>
+          <w:sz w:val="24"/>
+          <w:szCs w:val="24"/>
         </w:rPr>
         <w:t>普通融合只决定怎么合并特征；agentic fusion 根据检索错误反过来调整两条分支的训练责任。</w:t>
       </w:r>
@@ -1178,6 +1103,8 @@
               <w:spacing w:before="0" w:after="60" w:line="300" w:lineRule="auto"/>
               <w:rPr>
                 <w:rFonts w:hint="default" w:ascii="Times New Roman Regular" w:hAnsi="Times New Roman Regular" w:cs="Times New Roman Regular"/>
+                <w:sz w:val="24"/>
+                <w:szCs w:val="24"/>
               </w:rPr>
             </w:pPr>
             <w:r>
@@ -1191,117 +1118,117 @@
               </w:rPr>
               <w:t>Agentic feedback 如何进入对比目标</w:t>
             </w:r>
-            <w:bookmarkStart w:id="0" w:name="_GoBack"/>
-            <w:bookmarkEnd w:id="0"/>
           </w:p>
           <w:p>
             <w:pPr>
               <w:spacing w:before="0" w:after="60" w:line="280" w:lineRule="auto"/>
               <w:rPr>
                 <w:rFonts w:hint="default" w:ascii="Times New Roman Regular" w:hAnsi="Times New Roman Regular" w:cs="Times New Roman Regular"/>
-              </w:rPr>
-            </w:pPr>
-            <w:r>
-              <w:rPr>
-                <w:rFonts w:hint="default" w:ascii="Times New Roman Regular" w:hAnsi="Times New Roman Regular" w:eastAsia="微软雅黑" w:cs="Times New Roman Regular"/>
-                <w:sz w:val="20"/>
-                <w:szCs w:val="20"/>
+                <w:sz w:val="24"/>
+                <w:szCs w:val="24"/>
+              </w:rPr>
+            </w:pPr>
+            <w:r>
+              <w:rPr>
+                <w:rFonts w:hint="default" w:ascii="Times New Roman Regular" w:hAnsi="Times New Roman Regular" w:eastAsia="微软雅黑" w:cs="Times New Roman Regular"/>
+                <w:sz w:val="24"/>
+                <w:szCs w:val="24"/>
               </w:rPr>
               <w:t>positive sources:</w:t>
             </w:r>
             <w:r>
               <w:rPr>
                 <w:rFonts w:hint="default" w:ascii="Times New Roman Regular" w:hAnsi="Times New Roman Regular" w:eastAsia="微软雅黑" w:cs="Times New Roman Regular"/>
-                <w:sz w:val="20"/>
-                <w:szCs w:val="20"/>
+                <w:sz w:val="24"/>
+                <w:szCs w:val="24"/>
               </w:rPr>
               <w:br w:type="textWrapping"/>
             </w:r>
             <w:r>
               <w:rPr>
                 <w:rFonts w:hint="default" w:ascii="Times New Roman Regular" w:hAnsi="Times New Roman Regular" w:eastAsia="微软雅黑" w:cs="Times New Roman Regular"/>
-                <w:sz w:val="20"/>
-                <w:szCs w:val="20"/>
+                <w:sz w:val="24"/>
+                <w:szCs w:val="24"/>
               </w:rPr>
               <w:t xml:space="preserve">  paired view + raw neighbor + memory neighbor + planned + missed</w:t>
             </w:r>
             <w:r>
               <w:rPr>
                 <w:rFonts w:hint="default" w:ascii="Times New Roman Regular" w:hAnsi="Times New Roman Regular" w:eastAsia="微软雅黑" w:cs="Times New Roman Regular"/>
-                <w:sz w:val="20"/>
-                <w:szCs w:val="20"/>
+                <w:sz w:val="24"/>
+                <w:szCs w:val="24"/>
               </w:rPr>
               <w:br w:type="textWrapping"/>
             </w:r>
             <w:r>
               <w:rPr>
                 <w:rFonts w:hint="default" w:ascii="Times New Roman Regular" w:hAnsi="Times New Roman Regular" w:eastAsia="微软雅黑" w:cs="Times New Roman Regular"/>
-                <w:sz w:val="20"/>
-                <w:szCs w:val="20"/>
+                <w:sz w:val="24"/>
+                <w:szCs w:val="24"/>
               </w:rPr>
               <w:br w:type="textWrapping"/>
             </w:r>
             <w:r>
               <w:rPr>
                 <w:rFonts w:hint="default" w:ascii="Times New Roman Regular" w:hAnsi="Times New Roman Regular" w:eastAsia="微软雅黑" w:cs="Times New Roman Regular"/>
-                <w:sz w:val="20"/>
-                <w:szCs w:val="20"/>
+                <w:sz w:val="24"/>
+                <w:szCs w:val="24"/>
               </w:rPr>
               <w:t>hard negatives:</w:t>
             </w:r>
             <w:r>
               <w:rPr>
                 <w:rFonts w:hint="default" w:ascii="Times New Roman Regular" w:hAnsi="Times New Roman Regular" w:eastAsia="微软雅黑" w:cs="Times New Roman Regular"/>
-                <w:sz w:val="20"/>
-                <w:szCs w:val="20"/>
+                <w:sz w:val="24"/>
+                <w:szCs w:val="24"/>
               </w:rPr>
               <w:br w:type="textWrapping"/>
             </w:r>
             <w:r>
               <w:rPr>
                 <w:rFonts w:hint="default" w:ascii="Times New Roman Regular" w:hAnsi="Times New Roman Regular" w:eastAsia="微软雅黑" w:cs="Times New Roman Regular"/>
-                <w:sz w:val="20"/>
-                <w:szCs w:val="20"/>
+                <w:sz w:val="24"/>
+                <w:szCs w:val="24"/>
               </w:rPr>
               <w:t xml:space="preserve">  false retrievals = actual - planned</w:t>
             </w:r>
             <w:r>
               <w:rPr>
                 <w:rFonts w:hint="default" w:ascii="Times New Roman Regular" w:hAnsi="Times New Roman Regular" w:eastAsia="微软雅黑" w:cs="Times New Roman Regular"/>
-                <w:sz w:val="20"/>
-                <w:szCs w:val="20"/>
+                <w:sz w:val="24"/>
+                <w:szCs w:val="24"/>
               </w:rPr>
               <w:br w:type="textWrapping"/>
             </w:r>
             <w:r>
               <w:rPr>
                 <w:rFonts w:hint="default" w:ascii="Times New Roman Regular" w:hAnsi="Times New Roman Regular" w:eastAsia="微软雅黑" w:cs="Times New Roman Regular"/>
-                <w:sz w:val="20"/>
-                <w:szCs w:val="20"/>
+                <w:sz w:val="24"/>
+                <w:szCs w:val="24"/>
               </w:rPr>
               <w:br w:type="textWrapping"/>
             </w:r>
             <w:r>
               <w:rPr>
                 <w:rFonts w:hint="default" w:ascii="Times New Roman Regular" w:hAnsi="Times New Roman Regular" w:eastAsia="微软雅黑" w:cs="Times New Roman Regular"/>
-                <w:sz w:val="20"/>
-                <w:szCs w:val="20"/>
+                <w:sz w:val="24"/>
+                <w:szCs w:val="24"/>
               </w:rPr>
               <w:t>hash constraints:</w:t>
             </w:r>
             <w:r>
               <w:rPr>
                 <w:rFonts w:hint="default" w:ascii="Times New Roman Regular" w:hAnsi="Times New Roman Regular" w:eastAsia="微软雅黑" w:cs="Times New Roman Regular"/>
-                <w:sz w:val="20"/>
-                <w:szCs w:val="20"/>
+                <w:sz w:val="24"/>
+                <w:szCs w:val="24"/>
               </w:rPr>
               <w:br w:type="textWrapping"/>
             </w:r>
             <w:r>
               <w:rPr>
                 <w:rFonts w:hint="default" w:ascii="Times New Roman Regular" w:hAnsi="Times New Roman Regular" w:eastAsia="微软雅黑" w:cs="Times New Roman Regular"/>
-                <w:sz w:val="20"/>
-                <w:szCs w:val="20"/>
+                <w:sz w:val="24"/>
+                <w:szCs w:val="24"/>
               </w:rPr>
               <w:t xml:space="preserve">  quantization + bit balance</w:t>
             </w:r>
@@ -1311,6 +1238,8 @@
               <w:spacing w:before="0" w:after="40" w:line="300" w:lineRule="auto"/>
               <w:rPr>
                 <w:rFonts w:hint="default" w:ascii="Times New Roman Regular" w:hAnsi="Times New Roman Regular" w:cs="Times New Roman Regular"/>
+                <w:sz w:val="24"/>
+                <w:szCs w:val="24"/>
               </w:rPr>
             </w:pPr>
             <w:r>
@@ -1319,8 +1248,8 @@
                 <w:i/>
                 <w:iCs/>
                 <w:color w:val="555555"/>
-                <w:sz w:val="20"/>
-                <w:szCs w:val="20"/>
+                <w:sz w:val="24"/>
+                <w:szCs w:val="24"/>
               </w:rPr>
               <w:t>missed 是 hard positive，false 是 hard negative；trust / memory / persistence 决定这些反馈可信多少。</w:t>
             </w:r>
@@ -1333,22 +1262,24 @@
         <w:spacing w:before="0" w:after="120" w:line="300" w:lineRule="auto"/>
         <w:rPr>
           <w:rFonts w:hint="eastAsia" w:ascii="Times New Roman Regular" w:hAnsi="Times New Roman Regular" w:eastAsia="微软雅黑" w:cs="Times New Roman Regular"/>
+          <w:sz w:val="24"/>
+          <w:szCs w:val="24"/>
           <w:lang w:eastAsia="zh-CN"/>
         </w:rPr>
       </w:pPr>
       <w:r>
         <w:rPr>
           <w:rFonts w:hint="default" w:ascii="Times New Roman Regular" w:hAnsi="Times New Roman Regular" w:eastAsia="微软雅黑" w:cs="Times New Roman Regular"/>
-          <w:sz w:val="22"/>
-          <w:szCs w:val="22"/>
+          <w:sz w:val="24"/>
+          <w:szCs w:val="24"/>
         </w:rPr>
         <w:t>对比损失是内层可微优化接口，agentic retrieval 是外层训练范式</w:t>
       </w:r>
       <w:r>
         <w:rPr>
           <w:rFonts w:hint="eastAsia" w:ascii="Times New Roman Regular" w:hAnsi="Times New Roman Regular" w:eastAsia="微软雅黑" w:cs="Times New Roman Regular"/>
-          <w:sz w:val="22"/>
-          <w:szCs w:val="22"/>
+          <w:sz w:val="24"/>
+          <w:szCs w:val="24"/>
           <w:lang w:eastAsia="zh-CN"/>
         </w:rPr>
         <w:t>。</w:t>
@@ -1366,6 +1297,8 @@
         <w:spacing w:before="0" w:after="180" w:line="300" w:lineRule="auto"/>
         <w:rPr>
           <w:rFonts w:hint="eastAsia" w:ascii="Times New Roman Regular" w:hAnsi="Times New Roman Regular" w:eastAsia="宋体" w:cs="Times New Roman Regular"/>
+          <w:sz w:val="24"/>
+          <w:szCs w:val="24"/>
           <w:lang w:val="en-US" w:eastAsia="zh-CN"/>
         </w:rPr>
       </w:pPr>

</xml_diff>